<commit_message>
Alan üzerine gelince sarı mevzuat ipucu: yönetmelik madde metinleri ve ek özetleri
- Yönetmelik PDF'inden madde/fıkra/tanım metinlerini ayıklayan araç ve veri modülü
- Masaüstü arayüzü: etiket/kutu, tablo sütunu, satır düzenleme penceresi ve sonuç satırlarında sarı ipucu
- Web arayüzü: alan yardımı olarak aynı içerik
- Kılavuza bölüm 5.4 ve ekran görüntüleri; testler

Co-Authored-By: Claude Sonnet 5.5 <noreply@anthropic.com>
Claude-Session: https://claude.ai/code/session_01Y65w22BhwpQqtFCs8yHq45
</commit_message>
<xml_diff>
--- a/belgeler/Kullanim_Kilavuzu.docx
+++ b/belgeler/Kullanim_Kilavuzu.docx
@@ -66,7 +66,7 @@
           <w:b w:val="0"/>
           <w:i w:val="0"/>
         </w:rPr>
-        <w:t>Sürüm 1.0   —   05.10.2026</w:t>
+        <w:t>Sürüm 1.0   —   18.10.2026</w:t>
       </w:r>
     </w:p>
     <w:p>
@@ -6274,6 +6274,296 @@
     </w:p>
     <w:p>
       <w:pPr>
+        <w:pStyle w:val="Heading2"/>
+      </w:pPr>
+      <w:r>
+        <w:t>5.4 Mevzuat ipuçları (sarı bilgi penceresi)</w:t>
+      </w:r>
+    </w:p>
+    <w:p>
+      <w:pPr>
+        <w:spacing w:after="120"/>
+      </w:pPr>
+      <w:r>
+        <w:rPr>
+          <w:b w:val="0"/>
+          <w:i w:val="0"/>
+        </w:rPr>
+        <w:t>Programdaki her veri alanının etiketinin veya giriş kutusunun üzerine fareyi getirip yaklaşık yarım saniye bekleyin: sarı bir bilgi penceresi açılır. Pencere fareyi çektiğinizde kapanır. İçeriği:</w:t>
+      </w:r>
+    </w:p>
+    <w:p>
+      <w:pPr>
+        <w:pStyle w:val="ListBullet"/>
+        <w:spacing w:after="40"/>
+      </w:pPr>
+      <w:r>
+        <w:rPr>
+          <w:b/>
+        </w:rPr>
+        <w:t xml:space="preserve">Açıklama: </w:t>
+      </w:r>
+      <w:r>
+        <w:t>alanın adı ve nasıl doldurulacağı (koyu başlık ve açıklama);</w:t>
+      </w:r>
+    </w:p>
+    <w:p>
+      <w:pPr>
+        <w:pStyle w:val="ListBullet"/>
+        <w:spacing w:after="40"/>
+      </w:pPr>
+      <w:r>
+        <w:rPr>
+          <w:b/>
+        </w:rPr>
+        <w:t xml:space="preserve">Künye: </w:t>
+      </w:r>
+      <w:r>
+        <w:t>birim, bilginin hangi belgeden bulunacağı ve kimin dolduracağı (küçük yazı);</w:t>
+      </w:r>
+    </w:p>
+    <w:p>
+      <w:pPr>
+        <w:pStyle w:val="ListBullet"/>
+        <w:spacing w:after="40"/>
+      </w:pPr>
+      <w:r>
+        <w:rPr>
+          <w:b/>
+        </w:rPr>
+        <w:t xml:space="preserve">Programdaki etkisi: </w:t>
+      </w:r>
+      <w:r>
+        <w:t>alanın hangi hesaba girdiği ve dayanak madde numaraları;</w:t>
+      </w:r>
+    </w:p>
+    <w:p>
+      <w:pPr>
+        <w:pStyle w:val="ListBullet"/>
+        <w:spacing w:after="40"/>
+      </w:pPr>
+      <w:r>
+        <w:rPr>
+          <w:b/>
+        </w:rPr>
+        <w:t xml:space="preserve">Mevzuat metni: </w:t>
+      </w:r>
+      <w:r>
+        <w:t>ilgili yönetmelik maddesinin (fıkra/bent) kendi metni ve ilgili ekin (Ek-3/C, Ek-4, Ek-5/B vb.) özeti (mavi italik yazı).</w:t>
+      </w:r>
+    </w:p>
+    <w:p>
+      <w:pPr>
+        <w:jc w:val="center"/>
+      </w:pPr>
+      <w:r>
+        <w:drawing>
+          <wp:inline xmlns:a="http://schemas.openxmlformats.org/drawingml/2006/main" xmlns:pic="http://schemas.openxmlformats.org/drawingml/2006/picture">
+            <wp:extent cx="5940000" cy="3712500"/>
+            <wp:docPr id="2" name="Picture 2"/>
+            <wp:cNvGraphicFramePr>
+              <a:graphicFrameLocks noChangeAspect="1"/>
+            </wp:cNvGraphicFramePr>
+            <a:graphic>
+              <a:graphicData uri="http://schemas.openxmlformats.org/drawingml/2006/picture">
+                <pic:pic>
+                  <pic:nvPicPr>
+                    <pic:cNvPr id="0" name="10_ipucu_alan.png"/>
+                    <pic:cNvPicPr/>
+                  </pic:nvPicPr>
+                  <pic:blipFill>
+                    <a:blip r:embed="rId11"/>
+                    <a:stretch>
+                      <a:fillRect/>
+                    </a:stretch>
+                  </pic:blipFill>
+                  <pic:spPr>
+                    <a:xfrm>
+                      <a:off x="0" y="0"/>
+                      <a:ext cx="5940000" cy="3712500"/>
+                    </a:xfrm>
+                    <a:prstGeom prst="rect"/>
+                  </pic:spPr>
+                </pic:pic>
+              </a:graphicData>
+            </a:graphic>
+          </wp:inline>
+        </w:drawing>
+      </w:r>
+    </w:p>
+    <w:p>
+      <w:pPr>
+        <w:spacing w:after="120"/>
+        <w:jc w:val="center"/>
+      </w:pPr>
+      <w:r>
+        <w:rPr>
+          <w:b w:val="0"/>
+          <w:i/>
+          <w:sz w:val="17"/>
+        </w:rPr>
+        <w:t>Şekil — 'Yapı yüksekliği' alanının üzerine gelince açılan sarı ipucu (Madde 4 tanımı)</w:t>
+      </w:r>
+    </w:p>
+    <w:p>
+      <w:pPr>
+        <w:spacing w:after="120"/>
+      </w:pPr>
+      <w:r>
+        <w:rPr>
+          <w:b w:val="0"/>
+          <w:i w:val="0"/>
+        </w:rPr>
+        <w:t>Aynı ipucu tablolarda da çalışır: sütun başlığının (veya hücrenin) üzerine gelince o sütunla ilgili madde metni görünür; 'Satır ekle/Düzenle' penceresindeki etiketlerde de aynı bilgi vardır. Sonuçlar sekmesinde bir satırın üzerine gelince o satırın dayanak maddesinin metni gösterilir.</w:t>
+      </w:r>
+    </w:p>
+    <w:p>
+      <w:pPr>
+        <w:jc w:val="center"/>
+      </w:pPr>
+      <w:r>
+        <w:drawing>
+          <wp:inline xmlns:a="http://schemas.openxmlformats.org/drawingml/2006/main" xmlns:pic="http://schemas.openxmlformats.org/drawingml/2006/picture">
+            <wp:extent cx="5940000" cy="3712500"/>
+            <wp:docPr id="3" name="Picture 3"/>
+            <wp:cNvGraphicFramePr>
+              <a:graphicFrameLocks noChangeAspect="1"/>
+            </wp:cNvGraphicFramePr>
+            <a:graphic>
+              <a:graphicData uri="http://schemas.openxmlformats.org/drawingml/2006/picture">
+                <pic:pic>
+                  <pic:nvPicPr>
+                    <pic:cNvPr id="0" name="11_ipucu_tablo.png"/>
+                    <pic:cNvPicPr/>
+                  </pic:nvPicPr>
+                  <pic:blipFill>
+                    <a:blip r:embed="rId12"/>
+                    <a:stretch>
+                      <a:fillRect/>
+                    </a:stretch>
+                  </pic:blipFill>
+                  <pic:spPr>
+                    <a:xfrm>
+                      <a:off x="0" y="0"/>
+                      <a:ext cx="5940000" cy="3712500"/>
+                    </a:xfrm>
+                    <a:prstGeom prst="rect"/>
+                  </pic:spPr>
+                </pic:pic>
+              </a:graphicData>
+            </a:graphic>
+          </wp:inline>
+        </w:drawing>
+      </w:r>
+    </w:p>
+    <w:p>
+      <w:pPr>
+        <w:spacing w:after="120"/>
+        <w:jc w:val="center"/>
+      </w:pPr>
+      <w:r>
+        <w:rPr>
+          <w:b w:val="0"/>
+          <w:i/>
+          <w:sz w:val="17"/>
+        </w:rPr>
+        <w:t>Şekil — Tablo sütun başlığında ipucu (Madde 33(1) ve Ek-5/B)</w:t>
+      </w:r>
+    </w:p>
+    <w:p>
+      <w:pPr>
+        <w:jc w:val="center"/>
+      </w:pPr>
+      <w:r>
+        <w:drawing>
+          <wp:inline xmlns:a="http://schemas.openxmlformats.org/drawingml/2006/main" xmlns:pic="http://schemas.openxmlformats.org/drawingml/2006/picture">
+            <wp:extent cx="5940000" cy="3712500"/>
+            <wp:docPr id="4" name="Picture 4"/>
+            <wp:cNvGraphicFramePr>
+              <a:graphicFrameLocks noChangeAspect="1"/>
+            </wp:cNvGraphicFramePr>
+            <a:graphic>
+              <a:graphicData uri="http://schemas.openxmlformats.org/drawingml/2006/picture">
+                <pic:pic>
+                  <pic:nvPicPr>
+                    <pic:cNvPr id="0" name="12_ipucu_sonuc.png"/>
+                    <pic:cNvPicPr/>
+                  </pic:nvPicPr>
+                  <pic:blipFill>
+                    <a:blip r:embed="rId13"/>
+                    <a:stretch>
+                      <a:fillRect/>
+                    </a:stretch>
+                  </pic:blipFill>
+                  <pic:spPr>
+                    <a:xfrm>
+                      <a:off x="0" y="0"/>
+                      <a:ext cx="5940000" cy="3712500"/>
+                    </a:xfrm>
+                    <a:prstGeom prst="rect"/>
+                  </pic:spPr>
+                </pic:pic>
+              </a:graphicData>
+            </a:graphic>
+          </wp:inline>
+        </w:drawing>
+      </w:r>
+    </w:p>
+    <w:p>
+      <w:pPr>
+        <w:spacing w:after="120"/>
+        <w:jc w:val="center"/>
+      </w:pPr>
+      <w:r>
+        <w:rPr>
+          <w:b w:val="0"/>
+          <w:i/>
+          <w:sz w:val="17"/>
+        </w:rPr>
+        <w:t>Şekil — Sonuç satırında dayanak madde metni</w:t>
+      </w:r>
+    </w:p>
+    <w:tbl>
+      <w:tblPr>
+        <w:tblStyle w:val="TableGrid"/>
+        <w:tblW w:type="auto" w:w="0"/>
+        <w:tblLook w:firstColumn="1" w:firstRow="1" w:lastColumn="0" w:lastRow="0" w:noHBand="0" w:noVBand="1" w:val="04A0"/>
+      </w:tblPr>
+      <w:tblGrid>
+        <w:gridCol w:w="9638"/>
+      </w:tblGrid>
+      <w:tr>
+        <w:tc>
+          <w:tcPr>
+            <w:tcW w:type="dxa" w:w="9638"/>
+            <w:shd w:val="clear" w:color="auto" w:fill="FFF2CC"/>
+          </w:tcPr>
+          <w:p>
+            <w:r>
+              <w:rPr>
+                <w:sz w:val="19"/>
+              </w:rPr>
+            </w:r>
+            <w:r>
+              <w:rPr>
+                <w:b/>
+                <w:sz w:val="19"/>
+              </w:rPr>
+              <w:t xml:space="preserve">Not: </w:t>
+            </w:r>
+            <w:r>
+              <w:rPr>
+                <w:sz w:val="19"/>
+              </w:rPr>
+              <w:t>İpucu metinleri yönetmelik PDF'inden otomatik ayıklanmıştır (yangin/mevzuat_metin.py). Yönetmelik değişirse araclar/mevzuat_cikar.py ile yeniden üretilir. Metin, bilgilendirme amaçlı alıntıdır; resmî metin için Resmî Gazete'deki güncel yönetmeliğe bakın.</w:t>
+            </w:r>
+          </w:p>
+        </w:tc>
+      </w:tr>
+    </w:tbl>
+    <w:p/>
+    <w:p>
+      <w:pPr>
         <w:pStyle w:val="Heading1"/>
       </w:pPr>
       <w:r>
@@ -6320,7 +6610,7 @@
         <w:drawing>
           <wp:inline xmlns:a="http://schemas.openxmlformats.org/drawingml/2006/main" xmlns:pic="http://schemas.openxmlformats.org/drawingml/2006/picture">
             <wp:extent cx="5580000" cy="3487500"/>
-            <wp:docPr id="2" name="Picture 2"/>
+            <wp:docPr id="5" name="Picture 5"/>
             <wp:cNvGraphicFramePr>
               <a:graphicFrameLocks noChangeAspect="1"/>
             </wp:cNvGraphicFramePr>
@@ -9607,7 +9897,7 @@
                 <w:b w:val="0"/>
                 <w:sz w:val="15"/>
               </w:rPr>
-              <w:t>Dolap, hidrant, buton, söndürücü adedi hesabı</w:t>
+              <w:t>Madde 94(b)2, 95(3), 75(2), 99(4) — dolap, hidrant, buton, söndürücü adedi hesabı</w:t>
             </w:r>
           </w:p>
         </w:tc>
@@ -9717,7 +10007,7 @@
                 <w:b w:val="0"/>
                 <w:sz w:val="15"/>
               </w:rPr>
-              <w:t>Dolap, hidrant, buton, söndürücü adedi hesabı</w:t>
+              <w:t>Madde 94(b)2, 95(3), 75(2), 99(4) — dolap, hidrant, buton, söndürücü adedi hesabı</w:t>
             </w:r>
           </w:p>
         </w:tc>
@@ -9972,7 +10262,7 @@
         <w:drawing>
           <wp:inline xmlns:a="http://schemas.openxmlformats.org/drawingml/2006/main" xmlns:pic="http://schemas.openxmlformats.org/drawingml/2006/picture">
             <wp:extent cx="5580000" cy="3487500"/>
-            <wp:docPr id="3" name="Picture 3"/>
+            <wp:docPr id="6" name="Picture 6"/>
             <wp:cNvGraphicFramePr>
               <a:graphicFrameLocks noChangeAspect="1"/>
             </wp:cNvGraphicFramePr>
@@ -9984,7 +10274,7 @@
                     <pic:cNvPicPr/>
                   </pic:nvPicPr>
                   <pic:blipFill>
-                    <a:blip r:embed="rId11"/>
+                    <a:blip r:embed="rId14"/>
                     <a:stretch>
                       <a:fillRect/>
                     </a:stretch>
@@ -12924,7 +13214,7 @@
         <w:drawing>
           <wp:inline xmlns:a="http://schemas.openxmlformats.org/drawingml/2006/main" xmlns:pic="http://schemas.openxmlformats.org/drawingml/2006/picture">
             <wp:extent cx="5580000" cy="3487500"/>
-            <wp:docPr id="4" name="Picture 4"/>
+            <wp:docPr id="7" name="Picture 7"/>
             <wp:cNvGraphicFramePr>
               <a:graphicFrameLocks noChangeAspect="1"/>
             </wp:cNvGraphicFramePr>
@@ -12936,7 +13226,7 @@
                     <pic:cNvPicPr/>
                   </pic:nvPicPr>
                   <pic:blipFill>
-                    <a:blip r:embed="rId12"/>
+                    <a:blip r:embed="rId15"/>
                     <a:stretch>
                       <a:fillRect/>
                     </a:stretch>
@@ -14237,7 +14527,7 @@
         <w:drawing>
           <wp:inline xmlns:a="http://schemas.openxmlformats.org/drawingml/2006/main" xmlns:pic="http://schemas.openxmlformats.org/drawingml/2006/picture">
             <wp:extent cx="5580000" cy="3487500"/>
-            <wp:docPr id="5" name="Picture 5"/>
+            <wp:docPr id="8" name="Picture 8"/>
             <wp:cNvGraphicFramePr>
               <a:graphicFrameLocks noChangeAspect="1"/>
             </wp:cNvGraphicFramePr>
@@ -14249,7 +14539,7 @@
                     <pic:cNvPicPr/>
                   </pic:nvPicPr>
                   <pic:blipFill>
-                    <a:blip r:embed="rId13"/>
+                    <a:blip r:embed="rId16"/>
                     <a:stretch>
                       <a:fillRect/>
                     </a:stretch>
@@ -16628,7 +16918,7 @@
         <w:drawing>
           <wp:inline xmlns:a="http://schemas.openxmlformats.org/drawingml/2006/main" xmlns:pic="http://schemas.openxmlformats.org/drawingml/2006/picture">
             <wp:extent cx="5580000" cy="3487500"/>
-            <wp:docPr id="6" name="Picture 6"/>
+            <wp:docPr id="9" name="Picture 9"/>
             <wp:cNvGraphicFramePr>
               <a:graphicFrameLocks noChangeAspect="1"/>
             </wp:cNvGraphicFramePr>
@@ -16640,7 +16930,7 @@
                     <pic:cNvPicPr/>
                   </pic:nvPicPr>
                   <pic:blipFill>
-                    <a:blip r:embed="rId14"/>
+                    <a:blip r:embed="rId17"/>
                     <a:stretch>
                       <a:fillRect/>
                     </a:stretch>
@@ -19209,7 +19499,7 @@
         <w:drawing>
           <wp:inline xmlns:a="http://schemas.openxmlformats.org/drawingml/2006/main" xmlns:pic="http://schemas.openxmlformats.org/drawingml/2006/picture">
             <wp:extent cx="5580000" cy="3487500"/>
-            <wp:docPr id="7" name="Picture 7"/>
+            <wp:docPr id="10" name="Picture 10"/>
             <wp:cNvGraphicFramePr>
               <a:graphicFrameLocks noChangeAspect="1"/>
             </wp:cNvGraphicFramePr>
@@ -19221,7 +19511,7 @@
                     <pic:cNvPicPr/>
                   </pic:nvPicPr>
                   <pic:blipFill>
-                    <a:blip r:embed="rId15"/>
+                    <a:blip r:embed="rId18"/>
                     <a:stretch>
                       <a:fillRect/>
                     </a:stretch>
@@ -20318,7 +20608,7 @@
         <w:drawing>
           <wp:inline xmlns:a="http://schemas.openxmlformats.org/drawingml/2006/main" xmlns:pic="http://schemas.openxmlformats.org/drawingml/2006/picture">
             <wp:extent cx="5580000" cy="3487500"/>
-            <wp:docPr id="8" name="Picture 8"/>
+            <wp:docPr id="11" name="Picture 11"/>
             <wp:cNvGraphicFramePr>
               <a:graphicFrameLocks noChangeAspect="1"/>
             </wp:cNvGraphicFramePr>
@@ -20330,7 +20620,7 @@
                     <pic:cNvPicPr/>
                   </pic:nvPicPr>
                   <pic:blipFill>
-                    <a:blip r:embed="rId16"/>
+                    <a:blip r:embed="rId19"/>
                     <a:stretch>
                       <a:fillRect/>
                     </a:stretch>
@@ -23067,7 +23357,7 @@
         <w:drawing>
           <wp:inline xmlns:a="http://schemas.openxmlformats.org/drawingml/2006/main" xmlns:pic="http://schemas.openxmlformats.org/drawingml/2006/picture">
             <wp:extent cx="5940000" cy="3712500"/>
-            <wp:docPr id="9" name="Picture 9"/>
+            <wp:docPr id="12" name="Picture 12"/>
             <wp:cNvGraphicFramePr>
               <a:graphicFrameLocks noChangeAspect="1"/>
             </wp:cNvGraphicFramePr>
@@ -23079,7 +23369,7 @@
                     <pic:cNvPicPr/>
                   </pic:nvPicPr>
                   <pic:blipFill>
-                    <a:blip r:embed="rId17"/>
+                    <a:blip r:embed="rId20"/>
                     <a:stretch>
                       <a:fillRect/>
                     </a:stretch>
@@ -23916,7 +24206,7 @@
         <w:drawing>
           <wp:inline xmlns:a="http://schemas.openxmlformats.org/drawingml/2006/main" xmlns:pic="http://schemas.openxmlformats.org/drawingml/2006/picture">
             <wp:extent cx="5940000" cy="3712500"/>
-            <wp:docPr id="10" name="Picture 10"/>
+            <wp:docPr id="13" name="Picture 13"/>
             <wp:cNvGraphicFramePr>
               <a:graphicFrameLocks noChangeAspect="1"/>
             </wp:cNvGraphicFramePr>
@@ -23928,7 +24218,7 @@
                     <pic:cNvPicPr/>
                   </pic:nvPicPr>
                   <pic:blipFill>
-                    <a:blip r:embed="rId18"/>
+                    <a:blip r:embed="rId21"/>
                     <a:stretch>
                       <a:fillRect/>
                     </a:stretch>

</xml_diff>

<commit_message>
Yangın yükü modülü (bölüm bazında), Tanyeri-Tuzla projesi ve varsayım listesi
- q = Σ(kütle × alt ısıl değer)/alan, odun eşdeğeri, bölüm alanı Ek-4 (üretim/depo) kontrolü
- Masaüstü 'Yangın yükü' sekmesi, form tabloları (T7/T8), hesap dökümü ve raporlar
- Tanyeri (Tuzla) projesi: mahal listesi, kompartıman malzemeleri, varsayımlar ve açık sorular

Co-Authored-By: Claude Sonnet 5.5 <noreply@anthropic.com>
Claude-Session: https://claude.ai/code/session_01Y65w22BhwpQqtFCs8yHq45
</commit_message>
<xml_diff>
--- a/belgeler/Kullanim_Kilavuzu.docx
+++ b/belgeler/Kullanim_Kilavuzu.docx
@@ -66,7 +66,7 @@
           <w:b w:val="0"/>
           <w:i w:val="0"/>
         </w:rPr>
-        <w:t>Sürüm 1.0   —   18.10.2026</w:t>
+        <w:t>Sürüm 1.0   —   20.10.2026</w:t>
       </w:r>
     </w:p>
     <w:p>
@@ -3100,6 +3100,118 @@
                 <w:sz w:val="17"/>
               </w:rPr>
               <w:t>Mekanik duman tahliyesi gereken mahaller</w:t>
+            </w:r>
+          </w:p>
+        </w:tc>
+        <w:tc>
+          <w:tcPr>
+            <w:tcW w:type="dxa" w:w="2268"/>
+          </w:tcPr>
+          <w:p>
+            <w:pPr>
+              <w:spacing w:after="0"/>
+            </w:pPr>
+            <w:r/>
+            <w:r>
+              <w:rPr>
+                <w:b w:val="0"/>
+                <w:sz w:val="17"/>
+              </w:rPr>
+              <w:t>İşveren (varsa)</w:t>
+            </w:r>
+          </w:p>
+        </w:tc>
+      </w:tr>
+      <w:tr>
+        <w:tc>
+          <w:tcPr>
+            <w:tcW w:type="dxa" w:w="1928"/>
+          </w:tcPr>
+          <w:p>
+            <w:pPr>
+              <w:spacing w:after="0"/>
+            </w:pPr>
+            <w:r/>
+            <w:r>
+              <w:rPr>
+                <w:b w:val="0"/>
+                <w:sz w:val="17"/>
+              </w:rPr>
+              <w:t>T7_Yangin_Yuku_Bolumleri</w:t>
+            </w:r>
+          </w:p>
+        </w:tc>
+        <w:tc>
+          <w:tcPr>
+            <w:tcW w:type="dxa" w:w="5443"/>
+          </w:tcPr>
+          <w:p>
+            <w:pPr>
+              <w:spacing w:after="0"/>
+            </w:pPr>
+            <w:r/>
+            <w:r>
+              <w:rPr>
+                <w:b w:val="0"/>
+                <w:sz w:val="17"/>
+              </w:rPr>
+              <w:t>Yangın yükü: bölümler (kompartımanlar)</w:t>
+            </w:r>
+          </w:p>
+        </w:tc>
+        <w:tc>
+          <w:tcPr>
+            <w:tcW w:type="dxa" w:w="2268"/>
+          </w:tcPr>
+          <w:p>
+            <w:pPr>
+              <w:spacing w:after="0"/>
+            </w:pPr>
+            <w:r/>
+            <w:r>
+              <w:rPr>
+                <w:b w:val="0"/>
+                <w:sz w:val="17"/>
+              </w:rPr>
+              <w:t>İşveren (varsa)</w:t>
+            </w:r>
+          </w:p>
+        </w:tc>
+      </w:tr>
+      <w:tr>
+        <w:tc>
+          <w:tcPr>
+            <w:tcW w:type="dxa" w:w="1928"/>
+          </w:tcPr>
+          <w:p>
+            <w:pPr>
+              <w:spacing w:after="0"/>
+            </w:pPr>
+            <w:r/>
+            <w:r>
+              <w:rPr>
+                <w:b w:val="0"/>
+                <w:sz w:val="17"/>
+              </w:rPr>
+              <w:t>T8_Yangin_Yuku_Malzeme</w:t>
+            </w:r>
+          </w:p>
+        </w:tc>
+        <w:tc>
+          <w:tcPr>
+            <w:tcW w:type="dxa" w:w="5443"/>
+          </w:tcPr>
+          <w:p>
+            <w:pPr>
+              <w:spacing w:after="0"/>
+            </w:pPr>
+            <w:r/>
+            <w:r>
+              <w:rPr>
+                <w:b w:val="0"/>
+                <w:sz w:val="17"/>
+              </w:rPr>
+              <w:t>Yangın yükü: bölümlerdeki yanıcı malzemeler</w:t>
             </w:r>
           </w:p>
         </w:tc>
@@ -21285,6 +21397,492 @@
                 <w:sz w:val="16"/>
               </w:rPr>
               <w:t>Tavan yüksekliği (m).</w:t>
+            </w:r>
+          </w:p>
+        </w:tc>
+      </w:tr>
+    </w:tbl>
+    <w:p/>
+    <w:p>
+      <w:pPr>
+        <w:pStyle w:val="Heading3"/>
+      </w:pPr>
+      <w:r>
+        <w:t>Tablo 7 — Yangın yükü: bölümler (kompartımanlar)</w:t>
+      </w:r>
+    </w:p>
+    <w:p>
+      <w:pPr>
+        <w:spacing w:after="120"/>
+      </w:pPr>
+      <w:r>
+        <w:rPr>
+          <w:b w:val="0"/>
+          <w:i w:val="0"/>
+        </w:rPr>
+        <w:t>Yangın duvarlarıyla ayrılmış (veya ayrılması planlanan) her bölüm/kompartıman için bir satır: adı ve alanı.</w:t>
+      </w:r>
+    </w:p>
+    <w:p>
+      <w:pPr>
+        <w:spacing w:after="120"/>
+      </w:pPr>
+      <w:r>
+        <w:rPr>
+          <w:b w:val="0"/>
+          <w:i/>
+          <w:sz w:val="18"/>
+        </w:rPr>
+        <w:t>Program sekmesi: Yangın yükü → Bölümler.  Kaynak: Mimari plan, kompartıman çalışması.</w:t>
+      </w:r>
+    </w:p>
+    <w:tbl>
+      <w:tblPr>
+        <w:tblStyle w:val="TableGrid"/>
+        <w:tblW w:type="auto" w:w="0"/>
+        <w:jc w:val="center"/>
+        <w:tblLook w:firstColumn="1" w:firstRow="1" w:lastColumn="0" w:lastRow="0" w:noHBand="0" w:noVBand="1" w:val="04A0"/>
+      </w:tblPr>
+      <w:tblGrid>
+        <w:gridCol w:w="4819"/>
+        <w:gridCol w:w="4819"/>
+      </w:tblGrid>
+      <w:tr>
+        <w:trPr>
+          <w:tblHeader w:val="true"/>
+        </w:trPr>
+        <w:tc>
+          <w:tcPr>
+            <w:tcW w:type="dxa" w:w="2608"/>
+            <w:shd w:val="clear" w:color="auto" w:fill="1F3864"/>
+          </w:tcPr>
+          <w:p>
+            <w:pPr>
+              <w:spacing w:after="0"/>
+            </w:pPr>
+            <w:r/>
+            <w:r>
+              <w:rPr>
+                <w:b/>
+                <w:color w:val="FFFFFF"/>
+                <w:sz w:val="16"/>
+              </w:rPr>
+              <w:t>Sütun</w:t>
+            </w:r>
+          </w:p>
+        </w:tc>
+        <w:tc>
+          <w:tcPr>
+            <w:tcW w:type="dxa" w:w="7030"/>
+            <w:shd w:val="clear" w:color="auto" w:fill="1F3864"/>
+          </w:tcPr>
+          <w:p>
+            <w:pPr>
+              <w:spacing w:after="0"/>
+            </w:pPr>
+            <w:r/>
+            <w:r>
+              <w:rPr>
+                <w:b/>
+                <w:color w:val="FFFFFF"/>
+                <w:sz w:val="16"/>
+              </w:rPr>
+              <w:t>Açıklama</w:t>
+            </w:r>
+          </w:p>
+        </w:tc>
+      </w:tr>
+      <w:tr>
+        <w:tc>
+          <w:tcPr>
+            <w:tcW w:type="dxa" w:w="2608"/>
+          </w:tcPr>
+          <w:p>
+            <w:pPr>
+              <w:spacing w:after="0"/>
+            </w:pPr>
+            <w:r/>
+            <w:r>
+              <w:rPr>
+                <w:b w:val="0"/>
+                <w:sz w:val="16"/>
+              </w:rPr>
+              <w:t>Bölüm / kompartıman</w:t>
+            </w:r>
+          </w:p>
+        </w:tc>
+        <w:tc>
+          <w:tcPr>
+            <w:tcW w:type="dxa" w:w="7030"/>
+          </w:tcPr>
+          <w:p>
+            <w:pPr>
+              <w:spacing w:after="0"/>
+            </w:pPr>
+            <w:r/>
+            <w:r>
+              <w:rPr>
+                <w:b w:val="0"/>
+                <w:sz w:val="16"/>
+              </w:rPr>
+              <w:t>Bölümün adı (ör. Depo alt, Boyahane, Montaj). Tablo 8'deki bölüm adıyla AYNI yazın.</w:t>
+            </w:r>
+          </w:p>
+        </w:tc>
+      </w:tr>
+      <w:tr>
+        <w:tc>
+          <w:tcPr>
+            <w:tcW w:type="dxa" w:w="2608"/>
+          </w:tcPr>
+          <w:p>
+            <w:pPr>
+              <w:spacing w:after="0"/>
+            </w:pPr>
+            <w:r/>
+            <w:r>
+              <w:rPr>
+                <w:b w:val="0"/>
+                <w:sz w:val="16"/>
+              </w:rPr>
+              <w:t>Alan (m²)</w:t>
+            </w:r>
+          </w:p>
+        </w:tc>
+        <w:tc>
+          <w:tcPr>
+            <w:tcW w:type="dxa" w:w="7030"/>
+          </w:tcPr>
+          <w:p>
+            <w:pPr>
+              <w:spacing w:after="0"/>
+            </w:pPr>
+            <w:r/>
+            <w:r>
+              <w:rPr>
+                <w:b w:val="0"/>
+                <w:sz w:val="16"/>
+              </w:rPr>
+              <w:t>Bölümün alanı (m²) — mimari plandan.</w:t>
+            </w:r>
+          </w:p>
+        </w:tc>
+      </w:tr>
+      <w:tr>
+        <w:tc>
+          <w:tcPr>
+            <w:tcW w:type="dxa" w:w="2608"/>
+          </w:tcPr>
+          <w:p>
+            <w:pPr>
+              <w:spacing w:after="0"/>
+            </w:pPr>
+            <w:r/>
+            <w:r>
+              <w:rPr>
+                <w:b w:val="0"/>
+                <w:sz w:val="16"/>
+              </w:rPr>
+              <w:t>Kat</w:t>
+            </w:r>
+          </w:p>
+        </w:tc>
+        <w:tc>
+          <w:tcPr>
+            <w:tcW w:type="dxa" w:w="7030"/>
+          </w:tcPr>
+          <w:p>
+            <w:pPr>
+              <w:spacing w:after="0"/>
+            </w:pPr>
+            <w:r/>
+            <w:r>
+              <w:rPr>
+                <w:b w:val="0"/>
+                <w:sz w:val="16"/>
+              </w:rPr>
+              <w:t>Bulunduğu kat (bilgi).</w:t>
+            </w:r>
+          </w:p>
+        </w:tc>
+      </w:tr>
+      <w:tr>
+        <w:tc>
+          <w:tcPr>
+            <w:tcW w:type="dxa" w:w="2608"/>
+          </w:tcPr>
+          <w:p>
+            <w:pPr>
+              <w:spacing w:after="0"/>
+            </w:pPr>
+            <w:r/>
+            <w:r>
+              <w:rPr>
+                <w:b w:val="0"/>
+                <w:sz w:val="16"/>
+              </w:rPr>
+              <w:t>Kullanım</w:t>
+            </w:r>
+          </w:p>
+        </w:tc>
+        <w:tc>
+          <w:tcPr>
+            <w:tcW w:type="dxa" w:w="7030"/>
+          </w:tcPr>
+          <w:p>
+            <w:pPr>
+              <w:spacing w:after="0"/>
+            </w:pPr>
+            <w:r/>
+            <w:r>
+              <w:rPr>
+                <w:b w:val="0"/>
+                <w:sz w:val="16"/>
+              </w:rPr>
+              <w:t>Bölüm üretim alanı ise 'Endüstriyel (üretim)', depo ise 'Depo' seçin (Ek-4 kompartıman sınırı buna göre değişir).</w:t>
+            </w:r>
+          </w:p>
+        </w:tc>
+      </w:tr>
+    </w:tbl>
+    <w:p/>
+    <w:p>
+      <w:pPr>
+        <w:pStyle w:val="Heading3"/>
+      </w:pPr>
+      <w:r>
+        <w:t>Tablo 8 — Yangın yükü: bölümlerdeki yanıcı malzemeler</w:t>
+      </w:r>
+    </w:p>
+    <w:p>
+      <w:pPr>
+        <w:spacing w:after="120"/>
+      </w:pPr>
+      <w:r>
+        <w:rPr>
+          <w:b w:val="0"/>
+          <w:i w:val="0"/>
+        </w:rPr>
+        <w:t>Her bölümde bulunan yanıcı malzeme türü ve ortalama/azami miktarı (kg). Aynı bölümde birden fazla malzeme için ayrı satır yazın.</w:t>
+      </w:r>
+    </w:p>
+    <w:p>
+      <w:pPr>
+        <w:spacing w:after="120"/>
+      </w:pPr>
+      <w:r>
+        <w:rPr>
+          <w:b w:val="0"/>
+          <w:i/>
+          <w:sz w:val="18"/>
+        </w:rPr>
+        <w:t>Program sekmesi: Yangın yükü → Malzemeler.  Kaynak: Depo/üretim stok kayıtları, ambalaj ve malzeme listeleri, MSDS.</w:t>
+      </w:r>
+    </w:p>
+    <w:tbl>
+      <w:tblPr>
+        <w:tblStyle w:val="TableGrid"/>
+        <w:tblW w:type="auto" w:w="0"/>
+        <w:jc w:val="center"/>
+        <w:tblLook w:firstColumn="1" w:firstRow="1" w:lastColumn="0" w:lastRow="0" w:noHBand="0" w:noVBand="1" w:val="04A0"/>
+      </w:tblPr>
+      <w:tblGrid>
+        <w:gridCol w:w="4819"/>
+        <w:gridCol w:w="4819"/>
+      </w:tblGrid>
+      <w:tr>
+        <w:trPr>
+          <w:tblHeader w:val="true"/>
+        </w:trPr>
+        <w:tc>
+          <w:tcPr>
+            <w:tcW w:type="dxa" w:w="2608"/>
+            <w:shd w:val="clear" w:color="auto" w:fill="1F3864"/>
+          </w:tcPr>
+          <w:p>
+            <w:pPr>
+              <w:spacing w:after="0"/>
+            </w:pPr>
+            <w:r/>
+            <w:r>
+              <w:rPr>
+                <w:b/>
+                <w:color w:val="FFFFFF"/>
+                <w:sz w:val="16"/>
+              </w:rPr>
+              <w:t>Sütun</w:t>
+            </w:r>
+          </w:p>
+        </w:tc>
+        <w:tc>
+          <w:tcPr>
+            <w:tcW w:type="dxa" w:w="7030"/>
+            <w:shd w:val="clear" w:color="auto" w:fill="1F3864"/>
+          </w:tcPr>
+          <w:p>
+            <w:pPr>
+              <w:spacing w:after="0"/>
+            </w:pPr>
+            <w:r/>
+            <w:r>
+              <w:rPr>
+                <w:b/>
+                <w:color w:val="FFFFFF"/>
+                <w:sz w:val="16"/>
+              </w:rPr>
+              <w:t>Açıklama</w:t>
+            </w:r>
+          </w:p>
+        </w:tc>
+      </w:tr>
+      <w:tr>
+        <w:tc>
+          <w:tcPr>
+            <w:tcW w:type="dxa" w:w="2608"/>
+          </w:tcPr>
+          <w:p>
+            <w:pPr>
+              <w:spacing w:after="0"/>
+            </w:pPr>
+            <w:r/>
+            <w:r>
+              <w:rPr>
+                <w:b w:val="0"/>
+                <w:sz w:val="16"/>
+              </w:rPr>
+              <w:t>Bölüm / kompartıman</w:t>
+            </w:r>
+          </w:p>
+        </w:tc>
+        <w:tc>
+          <w:tcPr>
+            <w:tcW w:type="dxa" w:w="7030"/>
+          </w:tcPr>
+          <w:p>
+            <w:pPr>
+              <w:spacing w:after="0"/>
+            </w:pPr>
+            <w:r/>
+            <w:r>
+              <w:rPr>
+                <w:b w:val="0"/>
+                <w:sz w:val="16"/>
+              </w:rPr>
+              <w:t>Tablo 7'deki bölüm adı.</w:t>
+            </w:r>
+          </w:p>
+        </w:tc>
+      </w:tr>
+      <w:tr>
+        <w:tc>
+          <w:tcPr>
+            <w:tcW w:type="dxa" w:w="2608"/>
+          </w:tcPr>
+          <w:p>
+            <w:pPr>
+              <w:spacing w:after="0"/>
+            </w:pPr>
+            <w:r/>
+            <w:r>
+              <w:rPr>
+                <w:b w:val="0"/>
+                <w:sz w:val="16"/>
+              </w:rPr>
+              <w:t>Malzeme</w:t>
+            </w:r>
+          </w:p>
+        </w:tc>
+        <w:tc>
+          <w:tcPr>
+            <w:tcW w:type="dxa" w:w="7030"/>
+          </w:tcPr>
+          <w:p>
+            <w:pPr>
+              <w:spacing w:after="0"/>
+            </w:pPr>
+            <w:r/>
+            <w:r>
+              <w:rPr>
+                <w:b w:val="0"/>
+                <w:sz w:val="16"/>
+              </w:rPr>
+              <w:t>Malzeme türünü listeden seçin (alt ısıl değeri otomatik gelir).</w:t>
+            </w:r>
+          </w:p>
+        </w:tc>
+      </w:tr>
+      <w:tr>
+        <w:tc>
+          <w:tcPr>
+            <w:tcW w:type="dxa" w:w="2608"/>
+          </w:tcPr>
+          <w:p>
+            <w:pPr>
+              <w:spacing w:after="0"/>
+            </w:pPr>
+            <w:r/>
+            <w:r>
+              <w:rPr>
+                <w:b w:val="0"/>
+                <w:sz w:val="16"/>
+              </w:rPr>
+              <w:t>Miktar (kg)</w:t>
+            </w:r>
+          </w:p>
+        </w:tc>
+        <w:tc>
+          <w:tcPr>
+            <w:tcW w:type="dxa" w:w="7030"/>
+          </w:tcPr>
+          <w:p>
+            <w:pPr>
+              <w:spacing w:after="0"/>
+            </w:pPr>
+            <w:r/>
+            <w:r>
+              <w:rPr>
+                <w:b w:val="0"/>
+                <w:sz w:val="16"/>
+              </w:rPr>
+              <w:t>Bölümde bulunan miktar (kg). Dolu koli/kasa için içindekiler dahil toplam kütle.</w:t>
+            </w:r>
+          </w:p>
+        </w:tc>
+      </w:tr>
+      <w:tr>
+        <w:tc>
+          <w:tcPr>
+            <w:tcW w:type="dxa" w:w="2608"/>
+          </w:tcPr>
+          <w:p>
+            <w:pPr>
+              <w:spacing w:after="0"/>
+            </w:pPr>
+            <w:r/>
+            <w:r>
+              <w:rPr>
+                <w:b w:val="0"/>
+                <w:sz w:val="16"/>
+              </w:rPr>
+              <w:t>Isıl değer (MJ/kg) [0=tablodan]</w:t>
+            </w:r>
+          </w:p>
+        </w:tc>
+        <w:tc>
+          <w:tcPr>
+            <w:tcW w:type="dxa" w:w="7030"/>
+          </w:tcPr>
+          <w:p>
+            <w:pPr>
+              <w:spacing w:after="0"/>
+            </w:pPr>
+            <w:r/>
+            <w:r>
+              <w:rPr>
+                <w:b w:val="0"/>
+                <w:sz w:val="16"/>
+              </w:rPr>
+              <w:t>MSDS veya laboratuvar ısıl değeri (MJ/kg) biliniyorsa yazın; boşsa listedeki ortalama değer kullanılır.</w:t>
             </w:r>
           </w:p>
         </w:tc>

</xml_diff>